<commit_message>
fix: replace blank brackets () with underlines ＿＿ in all worksheets (HTML + Word)
</commit_message>
<xml_diff>
--- a/examples/一元一次方程式_10題小考卷.docx
+++ b/examples/一元一次方程式_10題小考卷.docx
@@ -109,6 +109,68 @@
                 <w:sz w:val="21"/>
               </w:rPr>
               <w:t>得分：＿＿＿＿</w:t>
+            </w:r>
+          </w:p>
+        </w:tc>
+      </w:tr>
+    </w:tbl>
+    <w:p>
+      <w:pPr>
+        <w:spacing w:after="40"/>
+      </w:pPr>
+    </w:p>
+    <w:tbl>
+      <w:tblPr>
+        <w:tblW w:type="auto" w:w="0"/>
+        <w:jc w:val="center"/>
+        <w:tblLayout w:type="fixed"/>
+        <w:tblLook w:firstColumn="1" w:firstRow="1" w:lastColumn="0" w:lastRow="0" w:noHBand="0" w:noVBand="1" w:val="04A0"/>
+      </w:tblPr>
+      <w:tblGrid>
+        <w:gridCol w:w="10800"/>
+      </w:tblGrid>
+      <w:tr>
+        <w:tc>
+          <w:tcPr>
+            <w:tcW w:type="dxa" w:w="10800"/>
+            <w:shd w:fill="F8FAFC"/>
+            <w:tcBorders>
+              <w:top w:val="single" w:sz="8" w:space="0" w:color="475569"/>
+              <w:left w:val="single" w:sz="8" w:space="0" w:color="475569"/>
+              <w:bottom w:val="single" w:sz="8" w:space="0" w:color="475569"/>
+              <w:right w:val="single" w:sz="8" w:space="0" w:color="475569"/>
+            </w:tcBorders>
+            <w:tcMar>
+              <w:top w:w="100" w:type="dxa"/>
+              <w:bottom w:w="100" w:type="dxa"/>
+              <w:left w:w="160" w:type="dxa"/>
+              <w:right w:w="160" w:type="dxa"/>
+            </w:tcMar>
+          </w:tcPr>
+          <w:p>
+            <w:pPr>
+              <w:spacing w:after="40"/>
+            </w:pPr>
+            <w:r>
+              <w:rPr>
+                <w:b/>
+                <w:color w:val="1E40AF"/>
+                <w:sz w:val="23"/>
+              </w:rPr>
+              <w:t>💡 觀念提醒：一元一次方程式移項解法</w:t>
+            </w:r>
+          </w:p>
+          <w:p>
+            <w:pPr>
+              <w:spacing w:after="0"/>
+            </w:pPr>
+            <w:r>
+              <w:rPr>
+                <w:b/>
+                <w:color w:val="1F2937"/>
+                <w:sz w:val="21"/>
+              </w:rPr>
+              <w:t>• 移項時，「減號」搬過等號要變成「加號」！數字黏在 x 前面時，搬過去對面要放到分母喔！</w:t>
             </w:r>
           </w:p>
         </w:tc>

</xml_diff>

<commit_message>
fix: Word docx blanks now use underlines ＿＿ instead of brackets ()
</commit_message>
<xml_diff>
--- a/examples/一元一次方程式_10題小考卷.docx
+++ b/examples/一元一次方程式_10題小考卷.docx
@@ -239,16 +239,13 @@
             </w:r>
             <m:oMath xmlns:mml="http://www.w3.org/1998/Math/MathML">
               <m:r>
-                <m:t>2x=9+(</m:t>
+                <m:t>2x=9+</m:t>
               </m:r>
               <m:r>
                 <m:rPr>
                   <m:nor/>
                 </m:rPr>
-                <m:t>  </m:t>
-              </m:r>
-              <m:r>
-                <m:t>)</m:t>
+                <m:t>＿＿</m:t>
               </m:r>
             </m:oMath>
           </w:p>
@@ -265,16 +262,13 @@
             </w:r>
             <m:oMath xmlns:mml="http://www.w3.org/1998/Math/MathML">
               <m:r>
-                <m:t>2x=(</m:t>
+                <m:t>2x=</m:t>
               </m:r>
               <m:r>
                 <m:rPr>
                   <m:nor/>
                 </m:rPr>
-                <m:t>  </m:t>
-              </m:r>
-              <m:r>
-                <m:t>)</m:t>
+                <m:t>＿＿</m:t>
               </m:r>
             </m:oMath>
           </w:p>
@@ -291,16 +285,13 @@
             </w:r>
             <m:oMath xmlns:mml="http://www.w3.org/1998/Math/MathML">
               <m:r>
-                <m:t>x=(</m:t>
+                <m:t>x=</m:t>
               </m:r>
               <m:r>
                 <m:rPr>
                   <m:nor/>
                 </m:rPr>
-                <m:t>  </m:t>
-              </m:r>
-              <m:r>
-                <m:t>)</m:t>
+                <m:t>＿＿</m:t>
               </m:r>
             </m:oMath>
           </w:p>
@@ -370,16 +361,13 @@
             </w:r>
             <m:oMath xmlns:mml="http://www.w3.org/1998/Math/MathML">
               <m:r>
-                <m:t>3x=13+(</m:t>
+                <m:t>3x=13+</m:t>
               </m:r>
               <m:r>
                 <m:rPr>
                   <m:nor/>
                 </m:rPr>
-                <m:t>  </m:t>
-              </m:r>
-              <m:r>
-                <m:t>)</m:t>
+                <m:t>＿＿</m:t>
               </m:r>
             </m:oMath>
           </w:p>
@@ -396,16 +384,13 @@
             </w:r>
             <m:oMath xmlns:mml="http://www.w3.org/1998/Math/MathML">
               <m:r>
-                <m:t>3x=(</m:t>
+                <m:t>3x=</m:t>
               </m:r>
               <m:r>
                 <m:rPr>
                   <m:nor/>
                 </m:rPr>
-                <m:t>  </m:t>
-              </m:r>
-              <m:r>
-                <m:t>)</m:t>
+                <m:t>＿＿</m:t>
               </m:r>
             </m:oMath>
           </w:p>
@@ -422,16 +407,13 @@
             </w:r>
             <m:oMath xmlns:mml="http://www.w3.org/1998/Math/MathML">
               <m:r>
-                <m:t>x=(</m:t>
+                <m:t>x=</m:t>
               </m:r>
               <m:r>
                 <m:rPr>
                   <m:nor/>
                 </m:rPr>
-                <m:t>  </m:t>
-              </m:r>
-              <m:r>
-                <m:t>)</m:t>
+                <m:t>＿＿</m:t>
               </m:r>
             </m:oMath>
           </w:p>
@@ -501,16 +483,13 @@
             </w:r>
             <m:oMath xmlns:mml="http://www.w3.org/1998/Math/MathML">
               <m:r>
-                <m:t>4x=11+(</m:t>
+                <m:t>4x=11+</m:t>
               </m:r>
               <m:r>
                 <m:rPr>
                   <m:nor/>
                 </m:rPr>
-                <m:t>  </m:t>
-              </m:r>
-              <m:r>
-                <m:t>)</m:t>
+                <m:t>＿＿</m:t>
               </m:r>
             </m:oMath>
           </w:p>
@@ -527,16 +506,13 @@
             </w:r>
             <m:oMath xmlns:mml="http://www.w3.org/1998/Math/MathML">
               <m:r>
-                <m:t>4x=(</m:t>
+                <m:t>4x=</m:t>
               </m:r>
               <m:r>
                 <m:rPr>
                   <m:nor/>
                 </m:rPr>
-                <m:t>  </m:t>
-              </m:r>
-              <m:r>
-                <m:t>)</m:t>
+                <m:t>＿＿</m:t>
               </m:r>
             </m:oMath>
           </w:p>
@@ -553,16 +529,13 @@
             </w:r>
             <m:oMath xmlns:mml="http://www.w3.org/1998/Math/MathML">
               <m:r>
-                <m:t>x=(</m:t>
+                <m:t>x=</m:t>
               </m:r>
               <m:r>
                 <m:rPr>
                   <m:nor/>
                 </m:rPr>
-                <m:t>  </m:t>
-              </m:r>
-              <m:r>
-                <m:t>)</m:t>
+                <m:t>＿＿</m:t>
               </m:r>
             </m:oMath>
           </w:p>
@@ -632,16 +605,13 @@
             </w:r>
             <m:oMath xmlns:mml="http://www.w3.org/1998/Math/MathML">
               <m:r>
-                <m:t>5x=22+(</m:t>
+                <m:t>5x=22+</m:t>
               </m:r>
               <m:r>
                 <m:rPr>
                   <m:nor/>
                 </m:rPr>
-                <m:t>  </m:t>
-              </m:r>
-              <m:r>
-                <m:t>)</m:t>
+                <m:t>＿＿</m:t>
               </m:r>
             </m:oMath>
           </w:p>
@@ -658,16 +628,13 @@
             </w:r>
             <m:oMath xmlns:mml="http://www.w3.org/1998/Math/MathML">
               <m:r>
-                <m:t>5x=(</m:t>
+                <m:t>5x=</m:t>
               </m:r>
               <m:r>
                 <m:rPr>
                   <m:nor/>
                 </m:rPr>
-                <m:t>  </m:t>
-              </m:r>
-              <m:r>
-                <m:t>)</m:t>
+                <m:t>＿＿</m:t>
               </m:r>
             </m:oMath>
           </w:p>
@@ -684,16 +651,13 @@
             </w:r>
             <m:oMath xmlns:mml="http://www.w3.org/1998/Math/MathML">
               <m:r>
-                <m:t>x=(</m:t>
+                <m:t>x=</m:t>
               </m:r>
               <m:r>
                 <m:rPr>
                   <m:nor/>
                 </m:rPr>
-                <m:t>  </m:t>
-              </m:r>
-              <m:r>
-                <m:t>)</m:t>
+                <m:t>＿＿</m:t>
               </m:r>
             </m:oMath>
           </w:p>
@@ -763,16 +727,13 @@
             </w:r>
             <m:oMath xmlns:mml="http://www.w3.org/1998/Math/MathML">
               <m:r>
-                <m:t>6x=20+(</m:t>
+                <m:t>6x=20+</m:t>
               </m:r>
               <m:r>
                 <m:rPr>
                   <m:nor/>
                 </m:rPr>
-                <m:t>  </m:t>
-              </m:r>
-              <m:r>
-                <m:t>)</m:t>
+                <m:t>＿＿</m:t>
               </m:r>
             </m:oMath>
           </w:p>
@@ -789,16 +750,13 @@
             </w:r>
             <m:oMath xmlns:mml="http://www.w3.org/1998/Math/MathML">
               <m:r>
-                <m:t>6x=(</m:t>
+                <m:t>6x=</m:t>
               </m:r>
               <m:r>
                 <m:rPr>
                   <m:nor/>
                 </m:rPr>
-                <m:t>  </m:t>
-              </m:r>
-              <m:r>
-                <m:t>)</m:t>
+                <m:t>＿＿</m:t>
               </m:r>
             </m:oMath>
           </w:p>
@@ -815,16 +773,13 @@
             </w:r>
             <m:oMath xmlns:mml="http://www.w3.org/1998/Math/MathML">
               <m:r>
-                <m:t>x=(</m:t>
+                <m:t>x=</m:t>
               </m:r>
               <m:r>
                 <m:rPr>
                   <m:nor/>
                 </m:rPr>
-                <m:t>  </m:t>
-              </m:r>
-              <m:r>
-                <m:t>)</m:t>
+                <m:t>＿＿</m:t>
               </m:r>
             </m:oMath>
           </w:p>
@@ -894,16 +849,13 @@
             </w:r>
             <m:oMath xmlns:mml="http://www.w3.org/1998/Math/MathML">
               <m:r>
-                <m:t>2x=11+(</m:t>
+                <m:t>2x=11+</m:t>
               </m:r>
               <m:r>
                 <m:rPr>
                   <m:nor/>
                 </m:rPr>
-                <m:t>  </m:t>
-              </m:r>
-              <m:r>
-                <m:t>)</m:t>
+                <m:t>＿＿</m:t>
               </m:r>
             </m:oMath>
           </w:p>
@@ -920,16 +872,13 @@
             </w:r>
             <m:oMath xmlns:mml="http://www.w3.org/1998/Math/MathML">
               <m:r>
-                <m:t>2x=(</m:t>
+                <m:t>2x=</m:t>
               </m:r>
               <m:r>
                 <m:rPr>
                   <m:nor/>
                 </m:rPr>
-                <m:t>  </m:t>
-              </m:r>
-              <m:r>
-                <m:t>)</m:t>
+                <m:t>＿＿</m:t>
               </m:r>
             </m:oMath>
           </w:p>
@@ -946,16 +895,13 @@
             </w:r>
             <m:oMath xmlns:mml="http://www.w3.org/1998/Math/MathML">
               <m:r>
-                <m:t>x=(</m:t>
+                <m:t>x=</m:t>
               </m:r>
               <m:r>
                 <m:rPr>
                   <m:nor/>
                 </m:rPr>
-                <m:t>  </m:t>
-              </m:r>
-              <m:r>
-                <m:t>)</m:t>
+                <m:t>＿＿</m:t>
               </m:r>
             </m:oMath>
           </w:p>
@@ -1025,16 +971,13 @@
             </w:r>
             <m:oMath xmlns:mml="http://www.w3.org/1998/Math/MathML">
               <m:r>
-                <m:t>3x=14+(</m:t>
+                <m:t>3x=14+</m:t>
               </m:r>
               <m:r>
                 <m:rPr>
                   <m:nor/>
                 </m:rPr>
-                <m:t>  </m:t>
-              </m:r>
-              <m:r>
-                <m:t>)</m:t>
+                <m:t>＿＿</m:t>
               </m:r>
             </m:oMath>
           </w:p>
@@ -1051,16 +994,13 @@
             </w:r>
             <m:oMath xmlns:mml="http://www.w3.org/1998/Math/MathML">
               <m:r>
-                <m:t>3x=(</m:t>
+                <m:t>3x=</m:t>
               </m:r>
               <m:r>
                 <m:rPr>
                   <m:nor/>
                 </m:rPr>
-                <m:t>  </m:t>
-              </m:r>
-              <m:r>
-                <m:t>)</m:t>
+                <m:t>＿＿</m:t>
               </m:r>
             </m:oMath>
           </w:p>
@@ -1077,16 +1017,13 @@
             </w:r>
             <m:oMath xmlns:mml="http://www.w3.org/1998/Math/MathML">
               <m:r>
-                <m:t>x=(</m:t>
+                <m:t>x=</m:t>
               </m:r>
               <m:r>
                 <m:rPr>
                   <m:nor/>
                 </m:rPr>
-                <m:t>  </m:t>
-              </m:r>
-              <m:r>
-                <m:t>)</m:t>
+                <m:t>＿＿</m:t>
               </m:r>
             </m:oMath>
           </w:p>
@@ -1156,16 +1093,13 @@
             </w:r>
             <m:oMath xmlns:mml="http://www.w3.org/1998/Math/MathML">
               <m:r>
-                <m:t>4x=15+(</m:t>
+                <m:t>4x=15+</m:t>
               </m:r>
               <m:r>
                 <m:rPr>
                   <m:nor/>
                 </m:rPr>
-                <m:t>  </m:t>
-              </m:r>
-              <m:r>
-                <m:t>)</m:t>
+                <m:t>＿＿</m:t>
               </m:r>
             </m:oMath>
           </w:p>
@@ -1182,16 +1116,13 @@
             </w:r>
             <m:oMath xmlns:mml="http://www.w3.org/1998/Math/MathML">
               <m:r>
-                <m:t>4x=(</m:t>
+                <m:t>4x=</m:t>
               </m:r>
               <m:r>
                 <m:rPr>
                   <m:nor/>
                 </m:rPr>
-                <m:t>  </m:t>
-              </m:r>
-              <m:r>
-                <m:t>)</m:t>
+                <m:t>＿＿</m:t>
               </m:r>
             </m:oMath>
           </w:p>
@@ -1208,16 +1139,13 @@
             </w:r>
             <m:oMath xmlns:mml="http://www.w3.org/1998/Math/MathML">
               <m:r>
-                <m:t>x=(</m:t>
+                <m:t>x=</m:t>
               </m:r>
               <m:r>
                 <m:rPr>
                   <m:nor/>
                 </m:rPr>
-                <m:t>  </m:t>
-              </m:r>
-              <m:r>
-                <m:t>)</m:t>
+                <m:t>＿＿</m:t>
               </m:r>
             </m:oMath>
           </w:p>
@@ -1287,16 +1215,13 @@
             </w:r>
             <m:oMath xmlns:mml="http://www.w3.org/1998/Math/MathML">
               <m:r>
-                <m:t>5x=19+(</m:t>
+                <m:t>5x=19+</m:t>
               </m:r>
               <m:r>
                 <m:rPr>
                   <m:nor/>
                 </m:rPr>
-                <m:t>  </m:t>
-              </m:r>
-              <m:r>
-                <m:t>)</m:t>
+                <m:t>＿＿</m:t>
               </m:r>
             </m:oMath>
           </w:p>
@@ -1313,16 +1238,13 @@
             </w:r>
             <m:oMath xmlns:mml="http://www.w3.org/1998/Math/MathML">
               <m:r>
-                <m:t>5x=(</m:t>
+                <m:t>5x=</m:t>
               </m:r>
               <m:r>
                 <m:rPr>
                   <m:nor/>
                 </m:rPr>
-                <m:t>  </m:t>
-              </m:r>
-              <m:r>
-                <m:t>)</m:t>
+                <m:t>＿＿</m:t>
               </m:r>
             </m:oMath>
           </w:p>
@@ -1339,16 +1261,13 @@
             </w:r>
             <m:oMath xmlns:mml="http://www.w3.org/1998/Math/MathML">
               <m:r>
-                <m:t>x=(</m:t>
+                <m:t>x=</m:t>
               </m:r>
               <m:r>
                 <m:rPr>
                   <m:nor/>
                 </m:rPr>
-                <m:t>  </m:t>
-              </m:r>
-              <m:r>
-                <m:t>)</m:t>
+                <m:t>＿＿</m:t>
               </m:r>
             </m:oMath>
           </w:p>
@@ -1418,16 +1337,13 @@
             </w:r>
             <m:oMath xmlns:mml="http://www.w3.org/1998/Math/MathML">
               <m:r>
-                <m:t>7x=26+(</m:t>
+                <m:t>7x=26+</m:t>
               </m:r>
               <m:r>
                 <m:rPr>
                   <m:nor/>
                 </m:rPr>
-                <m:t>  </m:t>
-              </m:r>
-              <m:r>
-                <m:t>)</m:t>
+                <m:t>＿＿</m:t>
               </m:r>
             </m:oMath>
           </w:p>
@@ -1444,16 +1360,13 @@
             </w:r>
             <m:oMath xmlns:mml="http://www.w3.org/1998/Math/MathML">
               <m:r>
-                <m:t>7x=(</m:t>
+                <m:t>7x=</m:t>
               </m:r>
               <m:r>
                 <m:rPr>
                   <m:nor/>
                 </m:rPr>
-                <m:t>  </m:t>
-              </m:r>
-              <m:r>
-                <m:t>)</m:t>
+                <m:t>＿＿</m:t>
               </m:r>
             </m:oMath>
           </w:p>
@@ -1470,16 +1383,13 @@
             </w:r>
             <m:oMath xmlns:mml="http://www.w3.org/1998/Math/MathML">
               <m:r>
-                <m:t>x=(</m:t>
+                <m:t>x=</m:t>
               </m:r>
               <m:r>
                 <m:rPr>
                   <m:nor/>
                 </m:rPr>
-                <m:t>  </m:t>
-              </m:r>
-              <m:r>
-                <m:t>)</m:t>
+                <m:t>＿＿</m:t>
               </m:r>
             </m:oMath>
           </w:p>

</xml_diff>